<commit_message>
Update VM shuttle SSH access workflow
</commit_message>
<xml_diff>
--- a/VM-tool-shuttle-workflow-improved-runbook.docx
+++ b/VM-tool-shuttle-workflow-improved-runbook.docx
@@ -3171,6 +3171,50 @@
       <w:cols w:space="720"/>
       <w:docGrid w:linePitch="360"/>
     </w:sectPr>
+    <w:p>
+      <w:pPr>
+        <w:pStyle w:val="Heading1"/>
+      </w:pPr>
+      <w:r>
+        <w:t xml:space="preserve">SSH Access Update - 2026-05-14</w:t>
+      </w:r>
+    </w:p>
+    <w:p>
+      <w:pPr/>
+      <w:r>
+        <w:t xml:space="preserve">The end of each VM shuttle workflow test must prove that the VM is reachable on the 192.168.86.0/24 LAN and that SSH login succeeds. A ping-only or console-only result is not sufficient.</w:t>
+      </w:r>
+    </w:p>
+    <w:p>
+      <w:pPr/>
+      <w:r>
+        <w:t xml:space="preserve">Guest preparation must install openssh-server, qemu-guest-agent, open-vm-tools, and cloud-init before the export or test boot.</w:t>
+      </w:r>
+    </w:p>
+    <w:p>
+      <w:pPr/>
+      <w:r>
+        <w:t xml:space="preserve">Create /run/sshd and /etc/ssh/sshd_config.d before starting sshd. Write /etc/ssh/sshd_config.d/99-codex-password-auth.conf with real newline-separated lines: PasswordAuthentication yes, then KbdInteractiveAuthentication yes. Do not write literal backslash-n characters into this file.</w:t>
+      </w:r>
+    </w:p>
+    <w:p>
+      <w:pPr/>
+      <w:r>
+        <w:t xml:space="preserve">Validate sshd with sshd -t, then enable and start ssh. If validation fails, fix the drop-in before continuing.</w:t>
+      </w:r>
+    </w:p>
+    <w:p>
+      <w:pPr/>
+      <w:r>
+        <w:t xml:space="preserve">When selecting the VM address, ignore 127.0.0.1 and any link-local addresses. Use the non-loopback bridge address from virsh domifaddr, the guest agent, nmap, or arp/neighbour discovery.</w:t>
+      </w:r>
+    </w:p>
+    <w:p>
+      <w:pPr/>
+      <w:r>
+        <w:t xml:space="preserve">The final test result must include the VM hostname, LAN IP, ssh service status, port 22 listening check, and a successful login test as the intended user.</w:t>
+      </w:r>
+    </w:p>
   </w:body>
 </w:document>
 </file>

</xml_diff>

<commit_message>
Document VM shuttle precheck findings
</commit_message>
<xml_diff>
--- a/VM-tool-shuttle-workflow-improved-runbook.docx
+++ b/VM-tool-shuttle-workflow-improved-runbook.docx
@@ -3215,6 +3215,50 @@
         <w:t xml:space="preserve">The final test result must include the VM hostname, LAN IP, ssh service status, port 22 listening check, and a successful login test as the intended user.</w:t>
       </w:r>
     </w:p>
+    <w:p>
+      <w:pPr>
+        <w:pStyle w:val="Heading1"/>
+      </w:pPr>
+      <w:r>
+        <w:t xml:space="preserve">Precheck Update - 2026-05-15</w:t>
+      </w:r>
+    </w:p>
+    <w:p>
+      <w:pPr/>
+      <w:r>
+        <w:t xml:space="preserve">The SSH-access workflow requires host-side validation tools in addition to the KVM and libvirt build tools.</w:t>
+      </w:r>
+    </w:p>
+    <w:p>
+      <w:pPr/>
+      <w:r>
+        <w:t xml:space="preserve">The 2026-05-15 kg55 precheck found sshpass and nmap missing. Both were installed and should be treated as required prerequisites for future VM shuttle tests.</w:t>
+      </w:r>
+    </w:p>
+    <w:p>
+      <w:pPr/>
+      <w:r>
+        <w:t xml:space="preserve">Install and verify prerequisites with: sudo apt update; sudo apt install -y sshpass nmap; command -v sshpass nmap virsh virt-install qemu-img virt-customize cloud-localds nc ip bridge brctl sha256sum curl git.</w:t>
+      </w:r>
+    </w:p>
+    <w:p>
+      <w:pPr/>
+      <w:r>
+        <w:t xml:space="preserve">For a clean second test, use a new VM name such as vm-shuttle-test02 if vm-shuttle-test01 is still defined or /srv/vms/vm-shuttle-test01 still exists.</w:t>
+      </w:r>
+    </w:p>
+    <w:p>
+      <w:pPr/>
+      <w:r>
+        <w:t xml:space="preserve">Existing exported VMDKs are point-in-time artifacts. If SSH was repaired after a VMDK was created, shut down the VM and regenerate the VMDK from the corrected disk before treating that export as final.</w:t>
+      </w:r>
+    </w:p>
+    <w:p>
+      <w:pPr/>
+      <w:r>
+        <w:t xml:space="preserve">Known-good kg55 precheck state: libvirtd and virtlogd active, /dev/kvm present, br0 up on enp5s0f0 with no host IPv4 address, gateway 192.168.86.1 reachable, binder1 192.168.86.33 reachable, Debian cloud image present, sshpass and nmap installed.</w:t>
+      </w:r>
+    </w:p>
   </w:body>
 </w:document>
 </file>

</xml_diff>

<commit_message>
Document VM shuttle test 2 cloud-init correction
</commit_message>
<xml_diff>
--- a/VM-tool-shuttle-workflow-improved-runbook.docx
+++ b/VM-tool-shuttle-workflow-improved-runbook.docx
@@ -3259,6 +3259,32 @@
         <w:t xml:space="preserve">Known-good kg55 precheck state: libvirtd and virtlogd active, /dev/kvm present, br0 up on enp5s0f0 with no host IPv4 address, gateway 192.168.86.1 reachable, binder1 192.168.86.33 reachable, Debian cloud image present, sshpass and nmap installed.</w:t>
       </w:r>
     </w:p>
+    <w:p>
+      <w:pPr>
+        <w:pStyle w:val="Heading1"/>
+      </w:pPr>
+      <w:r>
+        <w:t xml:space="preserve">Test 2 Cloud-Init Correction - 2026-05-15</w:t>
+      </w:r>
+    </w:p>
+    <w:p>
+      <w:pPr/>
+      <w:r>
+        <w:t xml:space="preserve">Do not include cloud-init status --wait inside cloud-init runcmd. During vm-shuttle-test02 it self-waited during final stage because cloud-init was waiting for itself.</w:t>
+      </w:r>
+    </w:p>
+    <w:p>
+      <w:pPr/>
+      <w:r>
+        <w:t xml:space="preserve">Run cloud-init status --long or cloud-init status --wait only from an external SSH validation session after TCP/22 is reachable.</w:t>
+      </w:r>
+    </w:p>
+    <w:p>
+      <w:pPr/>
+      <w:r>
+        <w:t xml:space="preserve">vm-shuttle-test02 succeeded after clearing the self-wait: SSH login, sshd validation, qemu guest agent, clean shutdown, QCOW2 export, VMDK conversion, and checksums all passed.</w:t>
+      </w:r>
+    </w:p>
   </w:body>
 </w:document>
 </file>

</xml_diff>

<commit_message>
Document root password validation for VM shuttle
</commit_message>
<xml_diff>
--- a/VM-tool-shuttle-workflow-improved-runbook.docx
+++ b/VM-tool-shuttle-workflow-improved-runbook.docx
@@ -3285,6 +3285,38 @@
         <w:t xml:space="preserve">vm-shuttle-test02 succeeded after clearing the self-wait: SSH login, sshd validation, qemu guest agent, clean shutdown, QCOW2 export, VMDK conversion, and checksums all passed.</w:t>
       </w:r>
     </w:p>
+    <w:p>
+      <w:pPr>
+        <w:pStyle w:val="Heading1"/>
+      </w:pPr>
+      <w:r>
+        <w:t xml:space="preserve">Root Password And su - Update - 2026-05-15</w:t>
+      </w:r>
+    </w:p>
+    <w:p>
+      <w:pPr/>
+      <w:r>
+        <w:t xml:space="preserve">For lab test VMs where the operator expects su - to work, cloud-init must set the root password. su - asks for the root account password, not the greg user password.</w:t>
+      </w:r>
+    </w:p>
+    <w:p>
+      <w:pPr/>
+      <w:r>
+        <w:t xml:space="preserve">For this workflow, set root to the same temporary lab password as greg in cloud-init chpasswd unless a different password is specified.</w:t>
+      </w:r>
+    </w:p>
+    <w:p>
+      <w:pPr/>
+      <w:r>
+        <w:t xml:space="preserve">Validate before export with an SSH command that runs su - root -c "id; hostname" using the lab password.</w:t>
+      </w:r>
+    </w:p>
+    <w:p>
+      <w:pPr/>
+      <w:r>
+        <w:t xml:space="preserve">This is a lab convenience setting. Do not use a shared root and user password pattern for production or exposed systems.</w:t>
+      </w:r>
+    </w:p>
   </w:body>
 </w:document>
 </file>

</xml_diff>